<commit_message>
Add detailed 14-page report (PDF + DOCX) with all evidence screenshots integrated
- Integrate GitHub repo, CI/CD, Docker build, predict-call screenshots
- Add Prometheus graph, MLflow, Grafana, Swagger figures inline
- Add print stylesheet (report.css) and video runbook
</commit_message>
<xml_diff>
--- a/docs/report.docx
+++ b/docs/report.docx
@@ -28,7 +28,7 @@
         </w:p>
       </w:sdtContent>
     </w:sdt>
-    <w:bookmarkStart w:id="44" w:name="X93de20bbbba8b0be4e56be807ec5a690ffca4ab"/>
+    <w:bookmarkStart w:id="59" w:name="X93de20bbbba8b0be4e56be807ec5a690ffca4ab"/>
     <w:p>
       <w:pPr>
         <w:pStyle w:val="Heading1"/>
@@ -524,7 +524,7 @@
       </w:r>
     </w:p>
     <w:bookmarkEnd w:id="9"/>
-    <w:bookmarkStart w:id="10" w:name="setup-install-instructions"/>
+    <w:bookmarkStart w:id="13" w:name="setup-install-instructions"/>
     <w:p>
       <w:pPr>
         <w:pStyle w:val="Heading2"/>
@@ -1011,8 +1011,97 @@
         </w:tc>
       </w:tr>
     </w:tbl>
-    <w:bookmarkEnd w:id="10"/>
-    <w:bookmarkStart w:id="11" w:name="eda-findings"/>
+    <w:p>
+      <w:pPr>
+        <w:pStyle w:val="BodyText"/>
+      </w:pPr>
+      <w:r>
+        <w:t xml:space="preserve">The project is published as a public GitHub repository:</w:t>
+      </w:r>
+    </w:p>
+    <w:p>
+      <w:pPr>
+        <w:pStyle w:val="CaptionedFigure"/>
+      </w:pPr>
+      <w:r>
+        <w:drawing>
+          <wp:inline>
+            <wp:extent cx="5334000" cy="2949606"/>
+            <wp:effectExtent b="0" l="0" r="0" t="0"/>
+            <wp:docPr descr="GitHub repository" title="" id="11" name="Picture"/>
+            <a:graphic>
+              <a:graphicData uri="http://schemas.openxmlformats.org/drawingml/2006/picture">
+                <pic:pic>
+                  <pic:nvPicPr>
+                    <pic:cNvPr descr="../screenshots/evidence/github/1_GitHub_Repository.png" id="12" name="Picture"/>
+                    <pic:cNvPicPr>
+                      <a:picLocks noChangeArrowheads="1" noChangeAspect="1"/>
+                    </pic:cNvPicPr>
+                  </pic:nvPicPr>
+                  <pic:blipFill>
+                    <a:blip r:embed="rId10"/>
+                    <a:stretch>
+                      <a:fillRect/>
+                    </a:stretch>
+                  </pic:blipFill>
+                  <pic:spPr bwMode="auto">
+                    <a:xfrm>
+                      <a:off x="0" y="0"/>
+                      <a:ext cx="5334000" cy="2949606"/>
+                    </a:xfrm>
+                    <a:prstGeom prst="rect">
+                      <a:avLst/>
+                    </a:prstGeom>
+                    <a:noFill/>
+                    <a:ln w="9525">
+                      <a:noFill/>
+                      <a:headEnd/>
+                      <a:tailEnd/>
+                    </a:ln>
+                  </pic:spPr>
+                </pic:pic>
+              </a:graphicData>
+            </a:graphic>
+          </wp:inline>
+        </w:drawing>
+      </w:r>
+    </w:p>
+    <w:p>
+      <w:pPr>
+        <w:pStyle w:val="ImageCaption"/>
+      </w:pPr>
+      <w:r>
+        <w:t xml:space="preserve">GitHub repository</w:t>
+      </w:r>
+    </w:p>
+    <w:p>
+      <w:pPr>
+        <w:pStyle w:val="BodyText"/>
+      </w:pPr>
+      <w:r>
+        <w:rPr>
+          <w:i/>
+          <w:iCs/>
+        </w:rPr>
+        <w:t xml:space="preserve">Figure: repository root — code, notebooks, Docker, Helm, k8s, monitoring, tests and</w:t>
+      </w:r>
+      <w:r>
+        <w:rPr>
+          <w:i/>
+          <w:iCs/>
+        </w:rPr>
+        <w:t xml:space="preserve"> </w:t>
+      </w:r>
+      <w:r>
+        <w:rPr>
+          <w:i/>
+          <w:iCs/>
+        </w:rPr>
+        <w:t xml:space="preserve">CI workflow, with the language breakdown (Python, Jupyter, Shell, Dockerfile).</w:t>
+      </w:r>
+    </w:p>
+    <w:bookmarkEnd w:id="13"/>
+    <w:bookmarkStart w:id="14" w:name="eda-findings"/>
     <w:p>
       <w:pPr>
         <w:pStyle w:val="Heading2"/>
@@ -1459,8 +1548,8 @@
         <w:t xml:space="preserve">(confusion matrices and ROC curves for all three models).</w:t>
       </w:r>
     </w:p>
-    <w:bookmarkEnd w:id="11"/>
-    <w:bookmarkStart w:id="18" w:name="modelling-choices"/>
+    <w:bookmarkEnd w:id="14"/>
+    <w:bookmarkStart w:id="21" w:name="modelling-choices"/>
     <w:p>
       <w:pPr>
         <w:pStyle w:val="Heading2"/>
@@ -2197,18 +2286,18 @@
           <wp:inline>
             <wp:extent cx="4610420" cy="3688336"/>
             <wp:effectExtent b="0" l="0" r="0" t="0"/>
-            <wp:docPr descr="Random Forest ROC curve" title="" id="13" name="Picture"/>
+            <wp:docPr descr="Random Forest ROC curve" title="" id="16" name="Picture"/>
             <a:graphic>
               <a:graphicData uri="http://schemas.openxmlformats.org/drawingml/2006/picture">
                 <pic:pic>
                   <pic:nvPicPr>
-                    <pic:cNvPr descr="../reports/figures/random_forest_roc_curve.png" id="14" name="Picture"/>
+                    <pic:cNvPr descr="../reports/figures/random_forest_roc_curve.png" id="17" name="Picture"/>
                     <pic:cNvPicPr>
                       <a:picLocks noChangeArrowheads="1" noChangeAspect="1"/>
                     </pic:cNvPicPr>
                   </pic:nvPicPr>
                   <pic:blipFill>
-                    <a:blip r:embed="rId12"/>
+                    <a:blip r:embed="rId15"/>
                     <a:stretch>
                       <a:fillRect/>
                     </a:stretch>
@@ -2252,18 +2341,18 @@
           <wp:inline>
             <wp:extent cx="4149378" cy="3688336"/>
             <wp:effectExtent b="0" l="0" r="0" t="0"/>
-            <wp:docPr descr="Random Forest confusion matrix" title="" id="16" name="Picture"/>
+            <wp:docPr descr="Random Forest confusion matrix" title="" id="19" name="Picture"/>
             <a:graphic>
               <a:graphicData uri="http://schemas.openxmlformats.org/drawingml/2006/picture">
                 <pic:pic>
                   <pic:nvPicPr>
-                    <pic:cNvPr descr="../reports/figures/random_forest_confusion_matrix.png" id="17" name="Picture"/>
+                    <pic:cNvPr descr="../reports/figures/random_forest_confusion_matrix.png" id="20" name="Picture"/>
                     <pic:cNvPicPr>
                       <a:picLocks noChangeArrowheads="1" noChangeAspect="1"/>
                     </pic:cNvPicPr>
                   </pic:nvPicPr>
                   <pic:blipFill>
-                    <a:blip r:embed="rId15"/>
+                    <a:blip r:embed="rId18"/>
                     <a:stretch>
                       <a:fillRect/>
                     </a:stretch>
@@ -2298,8 +2387,8 @@
         <w:t xml:space="preserve">Random Forest confusion matrix</w:t>
       </w:r>
     </w:p>
-    <w:bookmarkEnd w:id="18"/>
-    <w:bookmarkStart w:id="25" w:name="experiment-tracking-summary-mlflow"/>
+    <w:bookmarkEnd w:id="21"/>
+    <w:bookmarkStart w:id="28" w:name="experiment-tracking-summary-mlflow"/>
     <w:p>
       <w:pPr>
         <w:pStyle w:val="Heading2"/>
@@ -2495,18 +2584,18 @@
           <wp:inline>
             <wp:extent cx="5334000" cy="3333750"/>
             <wp:effectExtent b="0" l="0" r="0" t="0"/>
-            <wp:docPr descr="MLflow experiment runs list" title="" id="20" name="Picture"/>
+            <wp:docPr descr="MLflow experiment runs list" title="" id="23" name="Picture"/>
             <a:graphic>
               <a:graphicData uri="http://schemas.openxmlformats.org/drawingml/2006/picture">
                 <pic:pic>
                   <pic:nvPicPr>
-                    <pic:cNvPr descr="../screenshots/evidence/ui/mlflow_experiments.png" id="21" name="Picture"/>
+                    <pic:cNvPr descr="../screenshots/evidence/ui/mlflow_experiments.png" id="24" name="Picture"/>
                     <pic:cNvPicPr>
                       <a:picLocks noChangeArrowheads="1" noChangeAspect="1"/>
                     </pic:cNvPicPr>
                   </pic:nvPicPr>
                   <pic:blipFill>
-                    <a:blip r:embed="rId19"/>
+                    <a:blip r:embed="rId22"/>
                     <a:stretch>
                       <a:fillRect/>
                     </a:stretch>
@@ -2562,18 +2651,18 @@
           <wp:inline>
             <wp:extent cx="5334000" cy="3667125"/>
             <wp:effectExtent b="0" l="0" r="0" t="0"/>
-            <wp:docPr descr="MLflow run detail" title="" id="23" name="Picture"/>
+            <wp:docPr descr="MLflow run detail" title="" id="26" name="Picture"/>
             <a:graphic>
               <a:graphicData uri="http://schemas.openxmlformats.org/drawingml/2006/picture">
                 <pic:pic>
                   <pic:nvPicPr>
-                    <pic:cNvPr descr="../screenshots/evidence/ui/mlflow_run_detail.png" id="24" name="Picture"/>
+                    <pic:cNvPr descr="../screenshots/evidence/ui/mlflow_run_detail.png" id="27" name="Picture"/>
                     <pic:cNvPicPr>
                       <a:picLocks noChangeArrowheads="1" noChangeAspect="1"/>
                     </pic:cNvPicPr>
                   </pic:nvPicPr>
                   <pic:blipFill>
-                    <a:blip r:embed="rId22"/>
+                    <a:blip r:embed="rId25"/>
                     <a:stretch>
                       <a:fillRect/>
                     </a:stretch>
@@ -2620,8 +2709,8 @@
         <w:t xml:space="preserve">Figure: parameters and the seven logged metrics for the best Random Forest run.</w:t>
       </w:r>
     </w:p>
-    <w:bookmarkEnd w:id="25"/>
-    <w:bookmarkStart w:id="26" w:name="reproducibility"/>
+    <w:bookmarkEnd w:id="28"/>
+    <w:bookmarkStart w:id="29" w:name="reproducibility"/>
     <w:p>
       <w:pPr>
         <w:pStyle w:val="Heading2"/>
@@ -2747,8 +2836,8 @@
         <w:t xml:space="preserve">.</w:t>
       </w:r>
     </w:p>
-    <w:bookmarkEnd w:id="26"/>
-    <w:bookmarkStart w:id="27" w:name="cicd-workflow"/>
+    <w:bookmarkEnd w:id="29"/>
+    <w:bookmarkStart w:id="36" w:name="cicd-workflow"/>
     <w:p>
       <w:pPr>
         <w:pStyle w:val="Heading2"/>
@@ -2957,32 +3046,259 @@
         <w:t xml:space="preserve"> </w:t>
       </w:r>
       <w:r>
-        <w:t xml:space="preserve">non-200 response from the containerised API. The GitHub Actions run screenshot</w:t>
-      </w:r>
-      <w:r>
-        <w:t xml:space="preserve"> </w:t>
-      </w:r>
-      <w:r>
-        <w:t xml:space="preserve">(</w:t>
-      </w:r>
-      <w:r>
-        <w:rPr>
-          <w:rStyle w:val="VerbatimChar"/>
-        </w:rPr>
-        <w:t xml:space="preserve">screenshots/evidence/ui/github_actions_pipeline.png</w:t>
-      </w:r>
-      <w:r>
-        <w:t xml:space="preserve">) is captured after the first</w:t>
-      </w:r>
-      <w:r>
-        <w:t xml:space="preserve"> </w:t>
-      </w:r>
-      <w:r>
-        <w:t xml:space="preserve">push to GitHub, once a workflow run is available.</w:t>
-      </w:r>
-    </w:p>
-    <w:bookmarkEnd w:id="27"/>
-    <w:bookmarkStart w:id="31" w:name="containerisation"/>
+        <w:t xml:space="preserve">non-200 response from the containerised API.</w:t>
+      </w:r>
+    </w:p>
+    <w:p>
+      <w:pPr>
+        <w:pStyle w:val="CaptionedFigure"/>
+      </w:pPr>
+      <w:r>
+        <w:drawing>
+          <wp:inline>
+            <wp:extent cx="5334000" cy="2954072"/>
+            <wp:effectExtent b="0" l="0" r="0" t="0"/>
+            <wp:docPr descr="GitHub Actions CI checks" title="" id="31" name="Picture"/>
+            <a:graphic>
+              <a:graphicData uri="http://schemas.openxmlformats.org/drawingml/2006/picture">
+                <pic:pic>
+                  <pic:nvPicPr>
+                    <pic:cNvPr descr="../screenshots/evidence/github/4_GitHub_CICD.png" id="32" name="Picture"/>
+                    <pic:cNvPicPr>
+                      <a:picLocks noChangeArrowheads="1" noChangeAspect="1"/>
+                    </pic:cNvPicPr>
+                  </pic:nvPicPr>
+                  <pic:blipFill>
+                    <a:blip r:embed="rId30"/>
+                    <a:stretch>
+                      <a:fillRect/>
+                    </a:stretch>
+                  </pic:blipFill>
+                  <pic:spPr bwMode="auto">
+                    <a:xfrm>
+                      <a:off x="0" y="0"/>
+                      <a:ext cx="5334000" cy="2954072"/>
+                    </a:xfrm>
+                    <a:prstGeom prst="rect">
+                      <a:avLst/>
+                    </a:prstGeom>
+                    <a:noFill/>
+                    <a:ln w="9525">
+                      <a:noFill/>
+                      <a:headEnd/>
+                      <a:tailEnd/>
+                    </a:ln>
+                  </pic:spPr>
+                </pic:pic>
+              </a:graphicData>
+            </a:graphic>
+          </wp:inline>
+        </w:drawing>
+      </w:r>
+    </w:p>
+    <w:p>
+      <w:pPr>
+        <w:pStyle w:val="ImageCaption"/>
+      </w:pPr>
+      <w:r>
+        <w:t xml:space="preserve">GitHub Actions CI checks</w:t>
+      </w:r>
+    </w:p>
+    <w:p>
+      <w:pPr>
+        <w:pStyle w:val="BodyText"/>
+      </w:pPr>
+      <w:r>
+        <w:rPr>
+          <w:i/>
+          <w:iCs/>
+        </w:rPr>
+        <w:t xml:space="preserve">Figure: GitHub Actions on push to</w:t>
+      </w:r>
+      <w:r>
+        <w:rPr>
+          <w:i/>
+          <w:iCs/>
+        </w:rPr>
+        <w:t xml:space="preserve"> </w:t>
+      </w:r>
+      <w:r>
+        <w:rPr>
+          <w:rStyle w:val="VerbatimChar"/>
+          <w:i/>
+          <w:iCs/>
+        </w:rPr>
+        <w:t xml:space="preserve">main</w:t>
+      </w:r>
+      <w:r>
+        <w:rPr>
+          <w:i/>
+          <w:iCs/>
+        </w:rPr>
+        <w:t xml:space="preserve"> </w:t>
+      </w:r>
+      <w:r>
+        <w:rPr>
+          <w:i/>
+          <w:iCs/>
+        </w:rPr>
+        <w:t xml:space="preserve">—</w:t>
+      </w:r>
+      <w:r>
+        <w:rPr>
+          <w:i/>
+          <w:iCs/>
+        </w:rPr>
+        <w:t xml:space="preserve"> </w:t>
+      </w:r>
+      <w:r>
+        <w:rPr>
+          <w:i/>
+          <w:iCs/>
+        </w:rPr>
+        <w:t xml:space="preserve">“Lint, test, and smoke-train”</w:t>
+      </w:r>
+      <w:r>
+        <w:rPr>
+          <w:i/>
+          <w:iCs/>
+        </w:rPr>
+        <w:t xml:space="preserve"> </w:t>
+      </w:r>
+      <w:r>
+        <w:rPr>
+          <w:i/>
+          <w:iCs/>
+        </w:rPr>
+        <w:t xml:space="preserve">succeeded,</w:t>
+      </w:r>
+      <w:r>
+        <w:rPr>
+          <w:i/>
+          <w:iCs/>
+        </w:rPr>
+        <w:t xml:space="preserve"> </w:t>
+      </w:r>
+      <w:r>
+        <w:rPr>
+          <w:i/>
+          <w:iCs/>
+        </w:rPr>
+        <w:t xml:space="preserve">“Build Docker image”</w:t>
+      </w:r>
+      <w:r>
+        <w:rPr>
+          <w:i/>
+          <w:iCs/>
+        </w:rPr>
+        <w:t xml:space="preserve"> </w:t>
+      </w:r>
+      <w:r>
+        <w:rPr>
+          <w:i/>
+          <w:iCs/>
+        </w:rPr>
+        <w:t xml:space="preserve">job running.</w:t>
+      </w:r>
+    </w:p>
+    <w:p>
+      <w:pPr>
+        <w:pStyle w:val="CaptionedFigure"/>
+      </w:pPr>
+      <w:r>
+        <w:drawing>
+          <wp:inline>
+            <wp:extent cx="5334000" cy="2954072"/>
+            <wp:effectExtent b="0" l="0" r="0" t="0"/>
+            <wp:docPr descr="GitHub Actions Docker build job" title="" id="34" name="Picture"/>
+            <a:graphic>
+              <a:graphicData uri="http://schemas.openxmlformats.org/drawingml/2006/picture">
+                <pic:pic>
+                  <pic:nvPicPr>
+                    <pic:cNvPr descr="../screenshots/evidence/github/5_GitHub_DockerImageBuild.png" id="35" name="Picture"/>
+                    <pic:cNvPicPr>
+                      <a:picLocks noChangeArrowheads="1" noChangeAspect="1"/>
+                    </pic:cNvPicPr>
+                  </pic:nvPicPr>
+                  <pic:blipFill>
+                    <a:blip r:embed="rId33"/>
+                    <a:stretch>
+                      <a:fillRect/>
+                    </a:stretch>
+                  </pic:blipFill>
+                  <pic:spPr bwMode="auto">
+                    <a:xfrm>
+                      <a:off x="0" y="0"/>
+                      <a:ext cx="5334000" cy="2954072"/>
+                    </a:xfrm>
+                    <a:prstGeom prst="rect">
+                      <a:avLst/>
+                    </a:prstGeom>
+                    <a:noFill/>
+                    <a:ln w="9525">
+                      <a:noFill/>
+                      <a:headEnd/>
+                      <a:tailEnd/>
+                    </a:ln>
+                  </pic:spPr>
+                </pic:pic>
+              </a:graphicData>
+            </a:graphic>
+          </wp:inline>
+        </w:drawing>
+      </w:r>
+    </w:p>
+    <w:p>
+      <w:pPr>
+        <w:pStyle w:val="ImageCaption"/>
+      </w:pPr>
+      <w:r>
+        <w:t xml:space="preserve">GitHub Actions Docker build job</w:t>
+      </w:r>
+    </w:p>
+    <w:p>
+      <w:pPr>
+        <w:pStyle w:val="BodyText"/>
+      </w:pPr>
+      <w:r>
+        <w:rPr>
+          <w:i/>
+          <w:iCs/>
+        </w:rPr>
+        <w:t xml:space="preserve">Figure: the</w:t>
+      </w:r>
+      <w:r>
+        <w:rPr>
+          <w:i/>
+          <w:iCs/>
+        </w:rPr>
+        <w:t xml:space="preserve"> </w:t>
+      </w:r>
+      <w:r>
+        <w:rPr>
+          <w:rStyle w:val="VerbatimChar"/>
+          <w:i/>
+          <w:iCs/>
+        </w:rPr>
+        <w:t xml:space="preserve">docker-build</w:t>
+      </w:r>
+      <w:r>
+        <w:rPr>
+          <w:i/>
+          <w:iCs/>
+        </w:rPr>
+        <w:t xml:space="preserve"> </w:t>
+      </w:r>
+      <w:r>
+        <w:rPr>
+          <w:i/>
+          <w:iCs/>
+        </w:rPr>
+        <w:t xml:space="preserve">job building the image and smoke-testing the container in CI.</w:t>
+      </w:r>
+    </w:p>
+    <w:bookmarkEnd w:id="36"/>
+    <w:bookmarkStart w:id="43" w:name="containerisation"/>
     <w:p>
       <w:pPr>
         <w:pStyle w:val="Heading2"/>
@@ -3250,18 +3566,18 @@
           <wp:inline>
             <wp:extent cx="5334000" cy="3333750"/>
             <wp:effectExtent b="0" l="0" r="0" t="0"/>
-            <wp:docPr descr="Swagger UI served by the container" title="" id="29" name="Picture"/>
+            <wp:docPr descr="Swagger UI served by the container" title="" id="38" name="Picture"/>
             <a:graphic>
               <a:graphicData uri="http://schemas.openxmlformats.org/drawingml/2006/picture">
                 <pic:pic>
                   <pic:nvPicPr>
-                    <pic:cNvPr descr="../screenshots/evidence/ui/swagger_docs.png" id="30" name="Picture"/>
+                    <pic:cNvPr descr="../screenshots/evidence/ui/swagger_docs.png" id="39" name="Picture"/>
                     <pic:cNvPicPr>
                       <a:picLocks noChangeArrowheads="1" noChangeAspect="1"/>
                     </pic:cNvPicPr>
                   </pic:nvPicPr>
                   <pic:blipFill>
-                    <a:blip r:embed="rId28"/>
+                    <a:blip r:embed="rId37"/>
                     <a:stretch>
                       <a:fillRect/>
                     </a:stretch>
@@ -3296,8 +3612,131 @@
         <w:t xml:space="preserve">Swagger UI served by the container</w:t>
       </w:r>
     </w:p>
-    <w:bookmarkEnd w:id="31"/>
-    <w:bookmarkStart w:id="32" w:name="kubernetes-deployment-docker-desktop"/>
+    <w:p>
+      <w:pPr>
+        <w:pStyle w:val="BodyText"/>
+      </w:pPr>
+      <w:r>
+        <w:rPr>
+          <w:i/>
+          <w:iCs/>
+        </w:rPr>
+        <w:t xml:space="preserve">Figure: interactive Swagger UI (</w:t>
+      </w:r>
+      <w:r>
+        <w:rPr>
+          <w:rStyle w:val="VerbatimChar"/>
+          <w:i/>
+          <w:iCs/>
+        </w:rPr>
+        <w:t xml:space="preserve">/docs</w:t>
+      </w:r>
+      <w:r>
+        <w:rPr>
+          <w:i/>
+          <w:iCs/>
+        </w:rPr>
+        <w:t xml:space="preserve">) served directly by the container.</w:t>
+      </w:r>
+    </w:p>
+    <w:p>
+      <w:pPr>
+        <w:pStyle w:val="CaptionedFigure"/>
+      </w:pPr>
+      <w:r>
+        <w:drawing>
+          <wp:inline>
+            <wp:extent cx="5334000" cy="1670928"/>
+            <wp:effectExtent b="0" l="0" r="0" t="0"/>
+            <wp:docPr descr="Sample /predict call" title="" id="41" name="Picture"/>
+            <a:graphic>
+              <a:graphicData uri="http://schemas.openxmlformats.org/drawingml/2006/picture">
+                <pic:pic>
+                  <pic:nvPicPr>
+                    <pic:cNvPr descr="../screenshots/evidence/github/3_GitHub_PredictCall.png" id="42" name="Picture"/>
+                    <pic:cNvPicPr>
+                      <a:picLocks noChangeArrowheads="1" noChangeAspect="1"/>
+                    </pic:cNvPicPr>
+                  </pic:nvPicPr>
+                  <pic:blipFill>
+                    <a:blip r:embed="rId40"/>
+                    <a:stretch>
+                      <a:fillRect/>
+                    </a:stretch>
+                  </pic:blipFill>
+                  <pic:spPr bwMode="auto">
+                    <a:xfrm>
+                      <a:off x="0" y="0"/>
+                      <a:ext cx="5334000" cy="1670928"/>
+                    </a:xfrm>
+                    <a:prstGeom prst="rect">
+                      <a:avLst/>
+                    </a:prstGeom>
+                    <a:noFill/>
+                    <a:ln w="9525">
+                      <a:noFill/>
+                      <a:headEnd/>
+                      <a:tailEnd/>
+                    </a:ln>
+                  </pic:spPr>
+                </pic:pic>
+              </a:graphicData>
+            </a:graphic>
+          </wp:inline>
+        </w:drawing>
+      </w:r>
+    </w:p>
+    <w:p>
+      <w:pPr>
+        <w:pStyle w:val="ImageCaption"/>
+      </w:pPr>
+      <w:r>
+        <w:t xml:space="preserve">Sample /predict call</w:t>
+      </w:r>
+    </w:p>
+    <w:p>
+      <w:pPr>
+        <w:pStyle w:val="BodyText"/>
+      </w:pPr>
+      <w:r>
+        <w:rPr>
+          <w:i/>
+          <w:iCs/>
+        </w:rPr>
+        <w:t xml:space="preserve">Figure: a sample</w:t>
+      </w:r>
+      <w:r>
+        <w:rPr>
+          <w:i/>
+          <w:iCs/>
+        </w:rPr>
+        <w:t xml:space="preserve"> </w:t>
+      </w:r>
+      <w:r>
+        <w:rPr>
+          <w:rStyle w:val="VerbatimChar"/>
+          <w:i/>
+          <w:iCs/>
+        </w:rPr>
+        <w:t xml:space="preserve">/predict</w:t>
+      </w:r>
+      <w:r>
+        <w:rPr>
+          <w:i/>
+          <w:iCs/>
+        </w:rPr>
+        <w:t xml:space="preserve"> </w:t>
+      </w:r>
+      <w:r>
+        <w:rPr>
+          <w:i/>
+          <w:iCs/>
+        </w:rPr>
+        <w:t xml:space="preserve">request/response against the running API.</w:t>
+      </w:r>
+    </w:p>
+    <w:bookmarkEnd w:id="43"/>
+    <w:bookmarkStart w:id="44" w:name="kubernetes-deployment-docker-desktop"/>
     <w:p>
       <w:pPr>
         <w:pStyle w:val="Heading2"/>
@@ -3711,8 +4150,8 @@
         <w:t xml:space="preserve">served through the Kubernetes Service</w:t>
       </w:r>
     </w:p>
-    <w:bookmarkEnd w:id="32"/>
-    <w:bookmarkStart w:id="39" w:name="monitoring-logging"/>
+    <w:bookmarkEnd w:id="44"/>
+    <w:bookmarkStart w:id="54" w:name="monitoring-logging"/>
     <w:p>
       <w:pPr>
         <w:pStyle w:val="Heading2"/>
@@ -3964,18 +4403,18 @@
           <wp:inline>
             <wp:extent cx="5334000" cy="4000500"/>
             <wp:effectExtent b="0" l="0" r="0" t="0"/>
-            <wp:docPr descr="Grafana dashboard" title="" id="34" name="Picture"/>
+            <wp:docPr descr="Grafana dashboard" title="" id="46" name="Picture"/>
             <a:graphic>
               <a:graphicData uri="http://schemas.openxmlformats.org/drawingml/2006/picture">
                 <pic:pic>
                   <pic:nvPicPr>
-                    <pic:cNvPr descr="../screenshots/evidence/ui/grafana_dashboard.png" id="35" name="Picture"/>
+                    <pic:cNvPr descr="../screenshots/evidence/ui/grafana_dashboard.png" id="47" name="Picture"/>
                     <pic:cNvPicPr>
                       <a:picLocks noChangeArrowheads="1" noChangeAspect="1"/>
                     </pic:cNvPicPr>
                   </pic:nvPicPr>
                   <pic:blipFill>
-                    <a:blip r:embed="rId33"/>
+                    <a:blip r:embed="rId45"/>
                     <a:stretch>
                       <a:fillRect/>
                     </a:stretch>
@@ -4045,18 +4484,18 @@
           <wp:inline>
             <wp:extent cx="5334000" cy="3333750"/>
             <wp:effectExtent b="0" l="0" r="0" t="0"/>
-            <wp:docPr descr="Prometheus targets" title="" id="37" name="Picture"/>
+            <wp:docPr descr="Prometheus targets" title="" id="49" name="Picture"/>
             <a:graphic>
               <a:graphicData uri="http://schemas.openxmlformats.org/drawingml/2006/picture">
                 <pic:pic>
                   <pic:nvPicPr>
-                    <pic:cNvPr descr="../screenshots/evidence/ui/prometheus_targets.png" id="38" name="Picture"/>
+                    <pic:cNvPr descr="../screenshots/evidence/ui/prometheus_targets.png" id="50" name="Picture"/>
                     <pic:cNvPicPr>
                       <a:picLocks noChangeArrowheads="1" noChangeAspect="1"/>
                     </pic:cNvPicPr>
                   </pic:nvPicPr>
                   <pic:blipFill>
-                    <a:blip r:embed="rId36"/>
+                    <a:blip r:embed="rId48"/>
                     <a:stretch>
                       <a:fillRect/>
                     </a:stretch>
@@ -4134,9 +4573,105 @@
     </w:p>
     <w:p>
       <w:pPr>
+        <w:pStyle w:val="CaptionedFigure"/>
+      </w:pPr>
+      <w:r>
+        <w:drawing>
+          <wp:inline>
+            <wp:extent cx="5334000" cy="3333750"/>
+            <wp:effectExtent b="0" l="0" r="0" t="0"/>
+            <wp:docPr descr="Prometheus graph — predictions counter" title="" id="52" name="Picture"/>
+            <a:graphic>
+              <a:graphicData uri="http://schemas.openxmlformats.org/drawingml/2006/picture">
+                <pic:pic>
+                  <pic:nvPicPr>
+                    <pic:cNvPr descr="../screenshots/evidence/ui/prometheus_graph.png" id="53" name="Picture"/>
+                    <pic:cNvPicPr>
+                      <a:picLocks noChangeArrowheads="1" noChangeAspect="1"/>
+                    </pic:cNvPicPr>
+                  </pic:nvPicPr>
+                  <pic:blipFill>
+                    <a:blip r:embed="rId51"/>
+                    <a:stretch>
+                      <a:fillRect/>
+                    </a:stretch>
+                  </pic:blipFill>
+                  <pic:spPr bwMode="auto">
+                    <a:xfrm>
+                      <a:off x="0" y="0"/>
+                      <a:ext cx="5334000" cy="3333750"/>
+                    </a:xfrm>
+                    <a:prstGeom prst="rect">
+                      <a:avLst/>
+                    </a:prstGeom>
+                    <a:noFill/>
+                    <a:ln w="9525">
+                      <a:noFill/>
+                      <a:headEnd/>
+                      <a:tailEnd/>
+                    </a:ln>
+                  </pic:spPr>
+                </pic:pic>
+              </a:graphicData>
+            </a:graphic>
+          </wp:inline>
+        </w:drawing>
+      </w:r>
+    </w:p>
+    <w:p>
+      <w:pPr>
+        <w:pStyle w:val="ImageCaption"/>
+      </w:pPr>
+      <w:r>
+        <w:t xml:space="preserve">Prometheus graph — predictions counter</w:t>
+      </w:r>
+    </w:p>
+    <w:p>
+      <w:pPr>
         <w:pStyle w:val="BodyText"/>
       </w:pPr>
       <w:r>
+        <w:rPr>
+          <w:i/>
+          <w:iCs/>
+        </w:rPr>
+        <w:t xml:space="preserve">Figure:</w:t>
+      </w:r>
+      <w:r>
+        <w:rPr>
+          <w:i/>
+          <w:iCs/>
+        </w:rPr>
+        <w:t xml:space="preserve"> </w:t>
+      </w:r>
+      <w:r>
+        <w:rPr>
+          <w:rStyle w:val="VerbatimChar"/>
+          <w:i/>
+          <w:iCs/>
+        </w:rPr>
+        <w:t xml:space="preserve">heart_predictions_total</w:t>
+      </w:r>
+      <w:r>
+        <w:rPr>
+          <w:i/>
+          <w:iCs/>
+        </w:rPr>
+        <w:t xml:space="preserve"> </w:t>
+      </w:r>
+      <w:r>
+        <w:rPr>
+          <w:i/>
+          <w:iCs/>
+        </w:rPr>
+        <w:t xml:space="preserve">plotted in the Prometheus expression browser.</w:t>
+      </w:r>
+    </w:p>
+    <w:p>
+      <w:pPr>
+        <w:pStyle w:val="BodyText"/>
+      </w:pPr>
+      <w:r>
         <w:t xml:space="preserve">Raw metric/logging evidence:</w:t>
       </w:r>
       <w:r>
@@ -4176,8 +4711,8 @@
         <w:t xml:space="preserve">(structured request logs).</w:t>
       </w:r>
     </w:p>
-    <w:bookmarkEnd w:id="39"/>
-    <w:bookmarkStart w:id="41" w:name="architecture-diagram"/>
+    <w:bookmarkEnd w:id="54"/>
+    <w:bookmarkStart w:id="56" w:name="architecture-diagram"/>
     <w:p>
       <w:pPr>
         <w:pStyle w:val="Heading2"/>
@@ -4250,7 +4785,7 @@
       <w:r>
         <w:t xml:space="preserve"> </w:t>
       </w:r>
-      <w:hyperlink r:id="rId40">
+      <w:hyperlink r:id="rId55">
         <w:r>
           <w:rPr>
             <w:rStyle w:val="Hyperlink"/>
@@ -4262,8 +4797,8 @@
         <w:t xml:space="preserve">.</w:t>
       </w:r>
     </w:p>
-    <w:bookmarkEnd w:id="41"/>
-    <w:bookmarkStart w:id="42" w:name="deliverables-checklist"/>
+    <w:bookmarkEnd w:id="56"/>
+    <w:bookmarkStart w:id="57" w:name="deliverables-checklist"/>
     <w:p>
       <w:pPr>
         <w:pStyle w:val="Heading2"/>
@@ -4491,8 +5026,8 @@
         <w:t xml:space="preserve">Short video recording of the pipeline</w:t>
       </w:r>
     </w:p>
-    <w:bookmarkEnd w:id="42"/>
-    <w:bookmarkStart w:id="43" w:name="academic-integrity-statement"/>
+    <w:bookmarkEnd w:id="57"/>
+    <w:bookmarkStart w:id="58" w:name="academic-integrity-statement"/>
     <w:p>
       <w:pPr>
         <w:pStyle w:val="Heading2"/>
@@ -4542,8 +5077,8 @@
         <w:t xml:space="preserve">and are standard MLOps tooling.</w:t>
       </w:r>
     </w:p>
-    <w:bookmarkEnd w:id="43"/>
-    <w:bookmarkEnd w:id="44"/>
+    <w:bookmarkEnd w:id="58"/>
+    <w:bookmarkEnd w:id="59"/>
     <w:sectPr>
       <w:footnotePr>
         <w:numRestart w:val="eachSect"/>

</xml_diff>

<commit_message>
Report: add video recording link + BITS-access disclaimer, replace section symbol
</commit_message>
<xml_diff>
--- a/docs/report.docx
+++ b/docs/report.docx
@@ -28,7 +28,7 @@
         </w:p>
       </w:sdtContent>
     </w:sdt>
-    <w:bookmarkStart w:id="59" w:name="X93de20bbbba8b0be4e56be807ec5a690ffca4ab"/>
+    <w:bookmarkStart w:id="60" w:name="X93de20bbbba8b0be4e56be807ec5a690ffca4ab"/>
     <w:p>
       <w:pPr>
         <w:pStyle w:val="Heading1"/>
@@ -109,7 +109,7 @@
         <w:t xml:space="preserve">:8000</w:t>
       </w:r>
       <w:r>
-        <w:t xml:space="preserve">) or local Kubernetes; run/access instructions in §2, §8, §9</w:t>
+        <w:t xml:space="preserve">) or local Kubernetes; run/access instructions in Section 2, Section 8, Section 9</w:t>
       </w:r>
       <w:r>
         <w:t xml:space="preserve"> </w:t>
@@ -124,8 +124,29 @@
       <w:r>
         <w:t xml:space="preserve"> </w:t>
       </w:r>
-      <w:r>
-        <w:t xml:space="preserve">&lt;link to short recording&gt;</w:t>
+      <w:hyperlink r:id="rId9">
+        <w:r>
+          <w:rPr>
+            <w:rStyle w:val="Hyperlink"/>
+          </w:rPr>
+          <w:t xml:space="preserve">Google Drive recording</w:t>
+        </w:r>
+      </w:hyperlink>
+      <w:r>
+        <w:t xml:space="preserve"> </w:t>
+      </w:r>
+      <w:r>
+        <w:t xml:space="preserve">—</w:t>
+      </w:r>
+      <w:r>
+        <w:t xml:space="preserve"> </w:t>
+      </w:r>
+      <w:r>
+        <w:rPr>
+          <w:i/>
+          <w:iCs/>
+        </w:rPr>
+        <w:t xml:space="preserve">Access restricted: only members of BITS Pilani can view this recording.</w:t>
       </w:r>
     </w:p>
     <w:p>
@@ -135,7 +156,7 @@
         </w:pict>
       </w:r>
     </w:p>
-    <w:bookmarkStart w:id="9" w:name="project-overview"/>
+    <w:bookmarkStart w:id="10" w:name="project-overview"/>
     <w:p>
       <w:pPr>
         <w:pStyle w:val="Heading2"/>
@@ -523,8 +544,8 @@
         <w:t xml:space="preserve">.</w:t>
       </w:r>
     </w:p>
-    <w:bookmarkEnd w:id="9"/>
-    <w:bookmarkStart w:id="13" w:name="setup-install-instructions"/>
+    <w:bookmarkEnd w:id="10"/>
+    <w:bookmarkStart w:id="14" w:name="setup-install-instructions"/>
     <w:p>
       <w:pPr>
         <w:pStyle w:val="Heading2"/>
@@ -1028,18 +1049,18 @@
           <wp:inline>
             <wp:extent cx="5334000" cy="2949606"/>
             <wp:effectExtent b="0" l="0" r="0" t="0"/>
-            <wp:docPr descr="GitHub repository" title="" id="11" name="Picture"/>
+            <wp:docPr descr="GitHub repository" title="" id="12" name="Picture"/>
             <a:graphic>
               <a:graphicData uri="http://schemas.openxmlformats.org/drawingml/2006/picture">
                 <pic:pic>
                   <pic:nvPicPr>
-                    <pic:cNvPr descr="../screenshots/evidence/github/1_GitHub_Repository.png" id="12" name="Picture"/>
+                    <pic:cNvPr descr="../screenshots/evidence/github/1_GitHub_Repository.png" id="13" name="Picture"/>
                     <pic:cNvPicPr>
                       <a:picLocks noChangeArrowheads="1" noChangeAspect="1"/>
                     </pic:cNvPicPr>
                   </pic:nvPicPr>
                   <pic:blipFill>
-                    <a:blip r:embed="rId10"/>
+                    <a:blip r:embed="rId11"/>
                     <a:stretch>
                       <a:fillRect/>
                     </a:stretch>
@@ -1100,8 +1121,8 @@
         <w:t xml:space="preserve">CI workflow, with the language breakdown (Python, Jupyter, Shell, Dockerfile).</w:t>
       </w:r>
     </w:p>
-    <w:bookmarkEnd w:id="13"/>
-    <w:bookmarkStart w:id="14" w:name="eda-findings"/>
+    <w:bookmarkEnd w:id="14"/>
+    <w:bookmarkStart w:id="15" w:name="eda-findings"/>
     <w:p>
       <w:pPr>
         <w:pStyle w:val="Heading2"/>
@@ -1548,8 +1569,8 @@
         <w:t xml:space="preserve">(confusion matrices and ROC curves for all three models).</w:t>
       </w:r>
     </w:p>
-    <w:bookmarkEnd w:id="14"/>
-    <w:bookmarkStart w:id="21" w:name="modelling-choices"/>
+    <w:bookmarkEnd w:id="15"/>
+    <w:bookmarkStart w:id="22" w:name="modelling-choices"/>
     <w:p>
       <w:pPr>
         <w:pStyle w:val="Heading2"/>
@@ -2286,18 +2307,18 @@
           <wp:inline>
             <wp:extent cx="4610420" cy="3688336"/>
             <wp:effectExtent b="0" l="0" r="0" t="0"/>
-            <wp:docPr descr="Random Forest ROC curve" title="" id="16" name="Picture"/>
+            <wp:docPr descr="Random Forest ROC curve" title="" id="17" name="Picture"/>
             <a:graphic>
               <a:graphicData uri="http://schemas.openxmlformats.org/drawingml/2006/picture">
                 <pic:pic>
                   <pic:nvPicPr>
-                    <pic:cNvPr descr="../reports/figures/random_forest_roc_curve.png" id="17" name="Picture"/>
+                    <pic:cNvPr descr="../reports/figures/random_forest_roc_curve.png" id="18" name="Picture"/>
                     <pic:cNvPicPr>
                       <a:picLocks noChangeArrowheads="1" noChangeAspect="1"/>
                     </pic:cNvPicPr>
                   </pic:nvPicPr>
                   <pic:blipFill>
-                    <a:blip r:embed="rId15"/>
+                    <a:blip r:embed="rId16"/>
                     <a:stretch>
                       <a:fillRect/>
                     </a:stretch>
@@ -2341,18 +2362,18 @@
           <wp:inline>
             <wp:extent cx="4149378" cy="3688336"/>
             <wp:effectExtent b="0" l="0" r="0" t="0"/>
-            <wp:docPr descr="Random Forest confusion matrix" title="" id="19" name="Picture"/>
+            <wp:docPr descr="Random Forest confusion matrix" title="" id="20" name="Picture"/>
             <a:graphic>
               <a:graphicData uri="http://schemas.openxmlformats.org/drawingml/2006/picture">
                 <pic:pic>
                   <pic:nvPicPr>
-                    <pic:cNvPr descr="../reports/figures/random_forest_confusion_matrix.png" id="20" name="Picture"/>
+                    <pic:cNvPr descr="../reports/figures/random_forest_confusion_matrix.png" id="21" name="Picture"/>
                     <pic:cNvPicPr>
                       <a:picLocks noChangeArrowheads="1" noChangeAspect="1"/>
                     </pic:cNvPicPr>
                   </pic:nvPicPr>
                   <pic:blipFill>
-                    <a:blip r:embed="rId18"/>
+                    <a:blip r:embed="rId19"/>
                     <a:stretch>
                       <a:fillRect/>
                     </a:stretch>
@@ -2387,8 +2408,8 @@
         <w:t xml:space="preserve">Random Forest confusion matrix</w:t>
       </w:r>
     </w:p>
-    <w:bookmarkEnd w:id="21"/>
-    <w:bookmarkStart w:id="28" w:name="experiment-tracking-summary-mlflow"/>
+    <w:bookmarkEnd w:id="22"/>
+    <w:bookmarkStart w:id="29" w:name="experiment-tracking-summary-mlflow"/>
     <w:p>
       <w:pPr>
         <w:pStyle w:val="Heading2"/>
@@ -2584,18 +2605,18 @@
           <wp:inline>
             <wp:extent cx="5334000" cy="3333750"/>
             <wp:effectExtent b="0" l="0" r="0" t="0"/>
-            <wp:docPr descr="MLflow experiment runs list" title="" id="23" name="Picture"/>
+            <wp:docPr descr="MLflow experiment runs list" title="" id="24" name="Picture"/>
             <a:graphic>
               <a:graphicData uri="http://schemas.openxmlformats.org/drawingml/2006/picture">
                 <pic:pic>
                   <pic:nvPicPr>
-                    <pic:cNvPr descr="../screenshots/evidence/ui/mlflow_experiments.png" id="24" name="Picture"/>
+                    <pic:cNvPr descr="../screenshots/evidence/ui/mlflow_experiments.png" id="25" name="Picture"/>
                     <pic:cNvPicPr>
                       <a:picLocks noChangeArrowheads="1" noChangeAspect="1"/>
                     </pic:cNvPicPr>
                   </pic:nvPicPr>
                   <pic:blipFill>
-                    <a:blip r:embed="rId22"/>
+                    <a:blip r:embed="rId23"/>
                     <a:stretch>
                       <a:fillRect/>
                     </a:stretch>
@@ -2651,18 +2672,18 @@
           <wp:inline>
             <wp:extent cx="5334000" cy="3667125"/>
             <wp:effectExtent b="0" l="0" r="0" t="0"/>
-            <wp:docPr descr="MLflow run detail" title="" id="26" name="Picture"/>
+            <wp:docPr descr="MLflow run detail" title="" id="27" name="Picture"/>
             <a:graphic>
               <a:graphicData uri="http://schemas.openxmlformats.org/drawingml/2006/picture">
                 <pic:pic>
                   <pic:nvPicPr>
-                    <pic:cNvPr descr="../screenshots/evidence/ui/mlflow_run_detail.png" id="27" name="Picture"/>
+                    <pic:cNvPr descr="../screenshots/evidence/ui/mlflow_run_detail.png" id="28" name="Picture"/>
                     <pic:cNvPicPr>
                       <a:picLocks noChangeArrowheads="1" noChangeAspect="1"/>
                     </pic:cNvPicPr>
                   </pic:nvPicPr>
                   <pic:blipFill>
-                    <a:blip r:embed="rId25"/>
+                    <a:blip r:embed="rId26"/>
                     <a:stretch>
                       <a:fillRect/>
                     </a:stretch>
@@ -2709,8 +2730,8 @@
         <w:t xml:space="preserve">Figure: parameters and the seven logged metrics for the best Random Forest run.</w:t>
       </w:r>
     </w:p>
-    <w:bookmarkEnd w:id="28"/>
-    <w:bookmarkStart w:id="29" w:name="reproducibility"/>
+    <w:bookmarkEnd w:id="29"/>
+    <w:bookmarkStart w:id="30" w:name="reproducibility"/>
     <w:p>
       <w:pPr>
         <w:pStyle w:val="Heading2"/>
@@ -2836,8 +2857,8 @@
         <w:t xml:space="preserve">.</w:t>
       </w:r>
     </w:p>
-    <w:bookmarkEnd w:id="29"/>
-    <w:bookmarkStart w:id="36" w:name="cicd-workflow"/>
+    <w:bookmarkEnd w:id="30"/>
+    <w:bookmarkStart w:id="37" w:name="cicd-workflow"/>
     <w:p>
       <w:pPr>
         <w:pStyle w:val="Heading2"/>
@@ -3058,18 +3079,18 @@
           <wp:inline>
             <wp:extent cx="5334000" cy="2954072"/>
             <wp:effectExtent b="0" l="0" r="0" t="0"/>
-            <wp:docPr descr="GitHub Actions CI checks" title="" id="31" name="Picture"/>
+            <wp:docPr descr="GitHub Actions CI checks" title="" id="32" name="Picture"/>
             <a:graphic>
               <a:graphicData uri="http://schemas.openxmlformats.org/drawingml/2006/picture">
                 <pic:pic>
                   <pic:nvPicPr>
-                    <pic:cNvPr descr="../screenshots/evidence/github/4_GitHub_CICD.png" id="32" name="Picture"/>
+                    <pic:cNvPr descr="../screenshots/evidence/github/4_GitHub_CICD.png" id="33" name="Picture"/>
                     <pic:cNvPicPr>
                       <a:picLocks noChangeArrowheads="1" noChangeAspect="1"/>
                     </pic:cNvPicPr>
                   </pic:nvPicPr>
                   <pic:blipFill>
-                    <a:blip r:embed="rId30"/>
+                    <a:blip r:embed="rId31"/>
                     <a:stretch>
                       <a:fillRect/>
                     </a:stretch>
@@ -3210,18 +3231,18 @@
           <wp:inline>
             <wp:extent cx="5334000" cy="2954072"/>
             <wp:effectExtent b="0" l="0" r="0" t="0"/>
-            <wp:docPr descr="GitHub Actions Docker build job" title="" id="34" name="Picture"/>
+            <wp:docPr descr="GitHub Actions Docker build job" title="" id="35" name="Picture"/>
             <a:graphic>
               <a:graphicData uri="http://schemas.openxmlformats.org/drawingml/2006/picture">
                 <pic:pic>
                   <pic:nvPicPr>
-                    <pic:cNvPr descr="../screenshots/evidence/github/5_GitHub_DockerImageBuild.png" id="35" name="Picture"/>
+                    <pic:cNvPr descr="../screenshots/evidence/github/5_GitHub_DockerImageBuild.png" id="36" name="Picture"/>
                     <pic:cNvPicPr>
                       <a:picLocks noChangeArrowheads="1" noChangeAspect="1"/>
                     </pic:cNvPicPr>
                   </pic:nvPicPr>
                   <pic:blipFill>
-                    <a:blip r:embed="rId33"/>
+                    <a:blip r:embed="rId34"/>
                     <a:stretch>
                       <a:fillRect/>
                     </a:stretch>
@@ -3297,8 +3318,8 @@
         <w:t xml:space="preserve">job building the image and smoke-testing the container in CI.</w:t>
       </w:r>
     </w:p>
-    <w:bookmarkEnd w:id="36"/>
-    <w:bookmarkStart w:id="43" w:name="containerisation"/>
+    <w:bookmarkEnd w:id="37"/>
+    <w:bookmarkStart w:id="44" w:name="containerisation"/>
     <w:p>
       <w:pPr>
         <w:pStyle w:val="Heading2"/>
@@ -3566,18 +3587,18 @@
           <wp:inline>
             <wp:extent cx="5334000" cy="3333750"/>
             <wp:effectExtent b="0" l="0" r="0" t="0"/>
-            <wp:docPr descr="Swagger UI served by the container" title="" id="38" name="Picture"/>
+            <wp:docPr descr="Swagger UI served by the container" title="" id="39" name="Picture"/>
             <a:graphic>
               <a:graphicData uri="http://schemas.openxmlformats.org/drawingml/2006/picture">
                 <pic:pic>
                   <pic:nvPicPr>
-                    <pic:cNvPr descr="../screenshots/evidence/ui/swagger_docs.png" id="39" name="Picture"/>
+                    <pic:cNvPr descr="../screenshots/evidence/ui/swagger_docs.png" id="40" name="Picture"/>
                     <pic:cNvPicPr>
                       <a:picLocks noChangeArrowheads="1" noChangeAspect="1"/>
                     </pic:cNvPicPr>
                   </pic:nvPicPr>
                   <pic:blipFill>
-                    <a:blip r:embed="rId37"/>
+                    <a:blip r:embed="rId38"/>
                     <a:stretch>
                       <a:fillRect/>
                     </a:stretch>
@@ -3648,18 +3669,18 @@
           <wp:inline>
             <wp:extent cx="5334000" cy="1670928"/>
             <wp:effectExtent b="0" l="0" r="0" t="0"/>
-            <wp:docPr descr="Sample /predict call" title="" id="41" name="Picture"/>
+            <wp:docPr descr="Sample /predict call" title="" id="42" name="Picture"/>
             <a:graphic>
               <a:graphicData uri="http://schemas.openxmlformats.org/drawingml/2006/picture">
                 <pic:pic>
                   <pic:nvPicPr>
-                    <pic:cNvPr descr="../screenshots/evidence/github/3_GitHub_PredictCall.png" id="42" name="Picture"/>
+                    <pic:cNvPr descr="../screenshots/evidence/github/3_GitHub_PredictCall.png" id="43" name="Picture"/>
                     <pic:cNvPicPr>
                       <a:picLocks noChangeArrowheads="1" noChangeAspect="1"/>
                     </pic:cNvPicPr>
                   </pic:nvPicPr>
                   <pic:blipFill>
-                    <a:blip r:embed="rId40"/>
+                    <a:blip r:embed="rId41"/>
                     <a:stretch>
                       <a:fillRect/>
                     </a:stretch>
@@ -3735,8 +3756,8 @@
         <w:t xml:space="preserve">request/response against the running API.</w:t>
       </w:r>
     </w:p>
-    <w:bookmarkEnd w:id="43"/>
-    <w:bookmarkStart w:id="44" w:name="kubernetes-deployment-docker-desktop"/>
+    <w:bookmarkEnd w:id="44"/>
+    <w:bookmarkStart w:id="45" w:name="kubernetes-deployment-docker-desktop"/>
     <w:p>
       <w:pPr>
         <w:pStyle w:val="Heading2"/>
@@ -4150,8 +4171,8 @@
         <w:t xml:space="preserve">served through the Kubernetes Service</w:t>
       </w:r>
     </w:p>
-    <w:bookmarkEnd w:id="44"/>
-    <w:bookmarkStart w:id="54" w:name="monitoring-logging"/>
+    <w:bookmarkEnd w:id="45"/>
+    <w:bookmarkStart w:id="55" w:name="monitoring-logging"/>
     <w:p>
       <w:pPr>
         <w:pStyle w:val="Heading2"/>
@@ -4403,18 +4424,18 @@
           <wp:inline>
             <wp:extent cx="5334000" cy="4000500"/>
             <wp:effectExtent b="0" l="0" r="0" t="0"/>
-            <wp:docPr descr="Grafana dashboard" title="" id="46" name="Picture"/>
+            <wp:docPr descr="Grafana dashboard" title="" id="47" name="Picture"/>
             <a:graphic>
               <a:graphicData uri="http://schemas.openxmlformats.org/drawingml/2006/picture">
                 <pic:pic>
                   <pic:nvPicPr>
-                    <pic:cNvPr descr="../screenshots/evidence/ui/grafana_dashboard.png" id="47" name="Picture"/>
+                    <pic:cNvPr descr="../screenshots/evidence/ui/grafana_dashboard.png" id="48" name="Picture"/>
                     <pic:cNvPicPr>
                       <a:picLocks noChangeArrowheads="1" noChangeAspect="1"/>
                     </pic:cNvPicPr>
                   </pic:nvPicPr>
                   <pic:blipFill>
-                    <a:blip r:embed="rId45"/>
+                    <a:blip r:embed="rId46"/>
                     <a:stretch>
                       <a:fillRect/>
                     </a:stretch>
@@ -4484,18 +4505,18 @@
           <wp:inline>
             <wp:extent cx="5334000" cy="3333750"/>
             <wp:effectExtent b="0" l="0" r="0" t="0"/>
-            <wp:docPr descr="Prometheus targets" title="" id="49" name="Picture"/>
+            <wp:docPr descr="Prometheus targets" title="" id="50" name="Picture"/>
             <a:graphic>
               <a:graphicData uri="http://schemas.openxmlformats.org/drawingml/2006/picture">
                 <pic:pic>
                   <pic:nvPicPr>
-                    <pic:cNvPr descr="../screenshots/evidence/ui/prometheus_targets.png" id="50" name="Picture"/>
+                    <pic:cNvPr descr="../screenshots/evidence/ui/prometheus_targets.png" id="51" name="Picture"/>
                     <pic:cNvPicPr>
                       <a:picLocks noChangeArrowheads="1" noChangeAspect="1"/>
                     </pic:cNvPicPr>
                   </pic:nvPicPr>
                   <pic:blipFill>
-                    <a:blip r:embed="rId48"/>
+                    <a:blip r:embed="rId49"/>
                     <a:stretch>
                       <a:fillRect/>
                     </a:stretch>
@@ -4580,18 +4601,18 @@
           <wp:inline>
             <wp:extent cx="5334000" cy="3333750"/>
             <wp:effectExtent b="0" l="0" r="0" t="0"/>
-            <wp:docPr descr="Prometheus graph — predictions counter" title="" id="52" name="Picture"/>
+            <wp:docPr descr="Prometheus graph — predictions counter" title="" id="53" name="Picture"/>
             <a:graphic>
               <a:graphicData uri="http://schemas.openxmlformats.org/drawingml/2006/picture">
                 <pic:pic>
                   <pic:nvPicPr>
-                    <pic:cNvPr descr="../screenshots/evidence/ui/prometheus_graph.png" id="53" name="Picture"/>
+                    <pic:cNvPr descr="../screenshots/evidence/ui/prometheus_graph.png" id="54" name="Picture"/>
                     <pic:cNvPicPr>
                       <a:picLocks noChangeArrowheads="1" noChangeAspect="1"/>
                     </pic:cNvPicPr>
                   </pic:nvPicPr>
                   <pic:blipFill>
-                    <a:blip r:embed="rId51"/>
+                    <a:blip r:embed="rId52"/>
                     <a:stretch>
                       <a:fillRect/>
                     </a:stretch>
@@ -4711,8 +4732,8 @@
         <w:t xml:space="preserve">(structured request logs).</w:t>
       </w:r>
     </w:p>
-    <w:bookmarkEnd w:id="54"/>
-    <w:bookmarkStart w:id="56" w:name="architecture-diagram"/>
+    <w:bookmarkEnd w:id="55"/>
+    <w:bookmarkStart w:id="57" w:name="architecture-diagram"/>
     <w:p>
       <w:pPr>
         <w:pStyle w:val="Heading2"/>
@@ -4785,7 +4806,7 @@
       <w:r>
         <w:t xml:space="preserve"> </w:t>
       </w:r>
-      <w:hyperlink r:id="rId55">
+      <w:hyperlink r:id="rId56">
         <w:r>
           <w:rPr>
             <w:rStyle w:val="Hyperlink"/>
@@ -4797,8 +4818,8 @@
         <w:t xml:space="preserve">.</w:t>
       </w:r>
     </w:p>
-    <w:bookmarkEnd w:id="56"/>
-    <w:bookmarkStart w:id="57" w:name="deliverables-checklist"/>
+    <w:bookmarkEnd w:id="57"/>
+    <w:bookmarkStart w:id="58" w:name="deliverables-checklist"/>
     <w:p>
       <w:pPr>
         <w:pStyle w:val="Heading2"/>
@@ -5011,7 +5032,7 @@
         </w:numPr>
       </w:pPr>
       <w:r>
-        <w:t xml:space="preserve">API access instructions (local — §2, §8, §9)</w:t>
+        <w:t xml:space="preserve">API access instructions (local — Section 2, Section 8, Section 9)</w:t>
       </w:r>
     </w:p>
     <w:p>
@@ -5026,8 +5047,8 @@
         <w:t xml:space="preserve">Short video recording of the pipeline</w:t>
       </w:r>
     </w:p>
-    <w:bookmarkEnd w:id="57"/>
-    <w:bookmarkStart w:id="58" w:name="academic-integrity-statement"/>
+    <w:bookmarkEnd w:id="58"/>
+    <w:bookmarkStart w:id="59" w:name="academic-integrity-statement"/>
     <w:p>
       <w:pPr>
         <w:pStyle w:val="Heading2"/>
@@ -5077,8 +5098,8 @@
         <w:t xml:space="preserve">and are standard MLOps tooling.</w:t>
       </w:r>
     </w:p>
-    <w:bookmarkEnd w:id="58"/>
     <w:bookmarkEnd w:id="59"/>
+    <w:bookmarkEnd w:id="60"/>
     <w:sectPr>
       <w:footnotePr>
         <w:numRestart w:val="eachSect"/>

</xml_diff>